<commit_message>
Hoàn thành 10 bài tập Dockerfile Tuần 04
</commit_message>
<xml_diff>
--- a/VoPhuocViet_22730761_Tuan04/MinhChung.docx
+++ b/VoPhuocViet_22730761_Tuan04/MinhChung.docx
@@ -40,6 +40,9 @@
         <w:ind w:left="720"/>
       </w:pPr>
       <w:r>
+        <w:rPr>
+          <w:noProof/>
+        </w:rPr>
         <w:drawing>
           <wp:inline distT="0" distB="0" distL="0" distR="0" wp14:anchorId="75D3F7A6" wp14:editId="0F26FE7D">
             <wp:extent cx="5943600" cy="610235"/>
@@ -100,6 +103,9 @@
         <w:ind w:left="720"/>
       </w:pPr>
       <w:r>
+        <w:rPr>
+          <w:noProof/>
+        </w:rPr>
         <w:drawing>
           <wp:inline distT="0" distB="0" distL="0" distR="0" wp14:anchorId="1E987A47" wp14:editId="33254F50">
             <wp:extent cx="5943600" cy="2609850"/>
@@ -201,6 +207,7 @@
       </w:pPr>
       <w:r>
         <w:rPr>
+          <w:noProof/>
           <w:lang w:val="vi-VN"/>
         </w:rPr>
         <w:drawing>
@@ -271,6 +278,7 @@
       </w:pPr>
       <w:r>
         <w:rPr>
+          <w:noProof/>
           <w:lang w:val="vi-VN"/>
         </w:rPr>
         <w:lastRenderedPageBreak/>
@@ -392,6 +400,9 @@
         <w:ind w:left="720"/>
       </w:pPr>
       <w:r>
+        <w:rPr>
+          <w:noProof/>
+        </w:rPr>
         <w:drawing>
           <wp:inline distT="0" distB="0" distL="0" distR="0" wp14:anchorId="6FDEAC93" wp14:editId="676233FA">
             <wp:extent cx="5943600" cy="1444625"/>
@@ -462,6 +473,9 @@
         <w:ind w:left="720"/>
       </w:pPr>
       <w:r>
+        <w:rPr>
+          <w:noProof/>
+        </w:rPr>
         <w:drawing>
           <wp:inline distT="0" distB="0" distL="0" distR="0" wp14:anchorId="1C984563" wp14:editId="1B4C8D8B">
             <wp:extent cx="5943600" cy="524510"/>
@@ -532,6 +546,9 @@
         <w:ind w:left="720"/>
       </w:pPr>
       <w:r>
+        <w:rPr>
+          <w:noProof/>
+        </w:rPr>
         <w:drawing>
           <wp:inline distT="0" distB="0" distL="0" distR="0" wp14:anchorId="2ABA82DF" wp14:editId="3BE8E713">
             <wp:extent cx="5943600" cy="1720215"/>
@@ -595,6 +612,9 @@
         </w:rPr>
       </w:pPr>
       <w:r>
+        <w:rPr>
+          <w:noProof/>
+        </w:rPr>
         <w:lastRenderedPageBreak/>
         <w:drawing>
           <wp:inline distT="0" distB="0" distL="0" distR="0" wp14:anchorId="4C649212" wp14:editId="6A7C64E5">
@@ -656,6 +676,9 @@
         <w:ind w:left="720"/>
       </w:pPr>
       <w:r>
+        <w:rPr>
+          <w:noProof/>
+        </w:rPr>
         <w:drawing>
           <wp:inline distT="0" distB="0" distL="0" distR="0" wp14:anchorId="622055A2" wp14:editId="2C294814">
             <wp:extent cx="5943600" cy="420370"/>
@@ -716,6 +739,9 @@
         <w:ind w:left="720"/>
       </w:pPr>
       <w:r>
+        <w:rPr>
+          <w:noProof/>
+        </w:rPr>
         <w:drawing>
           <wp:inline distT="0" distB="0" distL="0" distR="0" wp14:anchorId="26725228" wp14:editId="0818D0CE">
             <wp:extent cx="5943600" cy="1007745"/>
@@ -776,6 +802,9 @@
         <w:ind w:left="720"/>
       </w:pPr>
       <w:r>
+        <w:rPr>
+          <w:noProof/>
+        </w:rPr>
         <w:drawing>
           <wp:inline distT="0" distB="0" distL="0" distR="0" wp14:anchorId="43CC3DEA" wp14:editId="2AC1BE58">
             <wp:extent cx="5943600" cy="1246505"/>
@@ -836,6 +865,9 @@
         <w:ind w:left="720"/>
       </w:pPr>
       <w:r>
+        <w:rPr>
+          <w:noProof/>
+        </w:rPr>
         <w:drawing>
           <wp:inline distT="0" distB="0" distL="0" distR="0" wp14:anchorId="63A19637" wp14:editId="1496FA62">
             <wp:extent cx="5943600" cy="698500"/>
@@ -897,6 +929,9 @@
         <w:ind w:left="720"/>
       </w:pPr>
       <w:r>
+        <w:rPr>
+          <w:noProof/>
+        </w:rPr>
         <w:drawing>
           <wp:inline distT="0" distB="0" distL="0" distR="0" wp14:anchorId="7A2A3148" wp14:editId="4E12F22D">
             <wp:extent cx="5943600" cy="5254625"/>
@@ -966,6 +1001,9 @@
         <w:tab/>
       </w:r>
       <w:r>
+        <w:rPr>
+          <w:noProof/>
+        </w:rPr>
         <w:drawing>
           <wp:inline distT="0" distB="0" distL="0" distR="0" wp14:anchorId="3CE26E86" wp14:editId="1BE1BC3A">
             <wp:extent cx="5943600" cy="4495165"/>
@@ -1026,6 +1064,9 @@
         <w:ind w:left="720"/>
       </w:pPr>
       <w:r>
+        <w:rPr>
+          <w:noProof/>
+        </w:rPr>
         <w:drawing>
           <wp:inline distT="0" distB="0" distL="0" distR="0" wp14:anchorId="109D3840" wp14:editId="04D1AAAD">
             <wp:extent cx="5943600" cy="458470"/>
@@ -1086,6 +1127,9 @@
         <w:ind w:left="720"/>
       </w:pPr>
       <w:r>
+        <w:rPr>
+          <w:noProof/>
+        </w:rPr>
         <w:drawing>
           <wp:inline distT="0" distB="0" distL="0" distR="0" wp14:anchorId="27FB1F79" wp14:editId="6C5BA26E">
             <wp:extent cx="5943600" cy="1141095"/>
@@ -1156,6 +1200,9 @@
         <w:ind w:left="720"/>
       </w:pPr>
       <w:r>
+        <w:rPr>
+          <w:noProof/>
+        </w:rPr>
         <w:lastRenderedPageBreak/>
         <w:drawing>
           <wp:inline distT="0" distB="0" distL="0" distR="0" wp14:anchorId="65750040" wp14:editId="11228F3A">
@@ -1217,6 +1264,9 @@
         <w:ind w:left="720"/>
       </w:pPr>
       <w:r>
+        <w:rPr>
+          <w:noProof/>
+        </w:rPr>
         <w:drawing>
           <wp:inline distT="0" distB="0" distL="0" distR="0" wp14:anchorId="118522A3" wp14:editId="3A72793E">
             <wp:extent cx="5943600" cy="3413125"/>
@@ -1257,7 +1307,7 @@
     <w:p>
       <w:r>
         <w:pict w14:anchorId="0A647442">
-          <v:rect id="_x0000_i1043" style="width:0;height:1.5pt" o:hralign="center" o:hrstd="t" o:hr="t" fillcolor="#a0a0a0" stroked="f"/>
+          <v:rect id="_x0000_i1025" style="width:0;height:1.5pt" o:hralign="center" o:hrstd="t" o:hr="t" fillcolor="#a0a0a0" stroked="f"/>
         </w:pict>
       </w:r>
     </w:p>
@@ -1306,6 +1356,9 @@
     </w:p>
     <w:p>
       <w:r>
+        <w:rPr>
+          <w:noProof/>
+        </w:rPr>
         <w:drawing>
           <wp:inline distT="0" distB="0" distL="0" distR="0" wp14:anchorId="04FC275D" wp14:editId="4BBC9397">
             <wp:extent cx="5943600" cy="1207135"/>
@@ -1360,6 +1413,9 @@
     </w:p>
     <w:p>
       <w:r>
+        <w:rPr>
+          <w:noProof/>
+        </w:rPr>
         <w:lastRenderedPageBreak/>
         <w:drawing>
           <wp:inline distT="0" distB="0" distL="0" distR="0" wp14:anchorId="371822D7" wp14:editId="278B9F3D">
@@ -1415,6 +1471,9 @@
     </w:p>
     <w:p>
       <w:r>
+        <w:rPr>
+          <w:noProof/>
+        </w:rPr>
         <w:drawing>
           <wp:inline distT="0" distB="0" distL="0" distR="0" wp14:anchorId="7A4A5D81" wp14:editId="54C23DBD">
             <wp:extent cx="5943600" cy="2141220"/>
@@ -1469,6 +1528,9 @@
     </w:p>
     <w:p>
       <w:r>
+        <w:rPr>
+          <w:noProof/>
+        </w:rPr>
         <w:drawing>
           <wp:inline distT="0" distB="0" distL="0" distR="0" wp14:anchorId="3D8E9608" wp14:editId="3265592B">
             <wp:extent cx="5943600" cy="713740"/>
@@ -1523,6 +1585,9 @@
     </w:p>
     <w:p>
       <w:r>
+        <w:rPr>
+          <w:noProof/>
+        </w:rPr>
         <w:drawing>
           <wp:inline distT="0" distB="0" distL="0" distR="0" wp14:anchorId="38C7B54B" wp14:editId="3CD9479B">
             <wp:extent cx="5943600" cy="474345"/>
@@ -1563,7 +1628,7 @@
     <w:p>
       <w:r>
         <w:pict w14:anchorId="4ACCAC9E">
-          <v:rect id="_x0000_i1044" style="width:0;height:1.5pt" o:hralign="center" o:hrstd="t" o:hr="t" fillcolor="#a0a0a0" stroked="f"/>
+          <v:rect id="_x0000_i1026" style="width:0;height:1.5pt" o:hralign="center" o:hrstd="t" o:hr="t" fillcolor="#a0a0a0" stroked="f"/>
         </w:pict>
       </w:r>
     </w:p>
@@ -1623,6 +1688,9 @@
         </w:rPr>
       </w:pPr>
       <w:r>
+        <w:rPr>
+          <w:noProof/>
+        </w:rPr>
         <w:drawing>
           <wp:inline distT="0" distB="0" distL="0" distR="0" wp14:anchorId="072B2EAD" wp14:editId="5C0D48D7">
             <wp:extent cx="5943600" cy="504190"/>
@@ -1691,6 +1759,7 @@
       </w:pPr>
       <w:r>
         <w:rPr>
+          <w:noProof/>
           <w:lang w:val="vi-VN"/>
         </w:rPr>
         <w:drawing>
@@ -1761,6 +1830,7 @@
       </w:pPr>
       <w:r>
         <w:rPr>
+          <w:noProof/>
           <w:lang w:val="vi-VN"/>
         </w:rPr>
         <w:drawing>
@@ -1811,7 +1881,7 @@
     <w:p>
       <w:r>
         <w:pict w14:anchorId="2906FC6C">
-          <v:rect id="_x0000_i1045" style="width:0;height:1.5pt" o:hralign="center" o:hrstd="t" o:hr="t" fillcolor="#a0a0a0" stroked="f"/>
+          <v:rect id="_x0000_i1027" style="width:0;height:1.5pt" o:hralign="center" o:hrstd="t" o:hr="t" fillcolor="#a0a0a0" stroked="f"/>
         </w:pict>
       </w:r>
     </w:p>
@@ -1895,6 +1965,7 @@
       </w:pPr>
       <w:r>
         <w:rPr>
+          <w:noProof/>
           <w:lang w:val="vi-VN"/>
         </w:rPr>
         <w:drawing>
@@ -1957,6 +2028,9 @@
         <w:ind w:left="720"/>
       </w:pPr>
       <w:r>
+        <w:rPr>
+          <w:noProof/>
+        </w:rPr>
         <w:lastRenderedPageBreak/>
         <w:drawing>
           <wp:inline distT="0" distB="0" distL="0" distR="0" wp14:anchorId="5484C359" wp14:editId="51F12E72">
@@ -2021,6 +2095,9 @@
         </w:numPr>
       </w:pPr>
       <w:r>
+        <w:rPr>
+          <w:noProof/>
+        </w:rPr>
         <w:drawing>
           <wp:inline distT="0" distB="0" distL="0" distR="0" wp14:anchorId="1BC1A627" wp14:editId="19E45BD3">
             <wp:extent cx="5943600" cy="488315"/>
@@ -2058,7 +2135,1084 @@
         </w:drawing>
       </w:r>
     </w:p>
-    <w:p/>
+    <w:p>
+      <w:pPr>
+        <w:rPr>
+          <w:lang w:val="vi-VN"/>
+        </w:rPr>
+      </w:pPr>
+      <w:r>
+        <w:t>Phần</w:t>
+      </w:r>
+      <w:r>
+        <w:rPr>
+          <w:lang w:val="vi-VN"/>
+        </w:rPr>
+        <w:t xml:space="preserve"> 2: Thao tác với docker file</w:t>
+      </w:r>
+    </w:p>
+    <w:p>
+      <w:pPr>
+        <w:rPr>
+          <w:lang w:val="vi-VN"/>
+        </w:rPr>
+      </w:pPr>
+      <w:r>
+        <w:rPr>
+          <w:lang w:val="vi-VN"/>
+        </w:rPr>
+        <w:t>Bài 1</w:t>
+      </w:r>
+    </w:p>
+    <w:p>
+      <w:pPr>
+        <w:rPr>
+          <w:lang w:val="vi-VN"/>
+        </w:rPr>
+      </w:pPr>
+      <w:r>
+        <w:rPr>
+          <w:lang w:val="vi-VN"/>
+        </w:rPr>
+        <w:t>docker build -t ex01-hello-app .</w:t>
+      </w:r>
+    </w:p>
+    <w:p>
+      <w:pPr>
+        <w:rPr>
+          <w:lang w:val="vi-VN"/>
+        </w:rPr>
+      </w:pPr>
+      <w:r>
+        <w:rPr>
+          <w:b/>
+          <w:bCs/>
+          <w:lang w:val="vi-VN"/>
+        </w:rPr>
+        <w:t>(</w:t>
+      </w:r>
+      <w:r>
+        <w:rPr>
+          <w:b/>
+          <w:bCs/>
+        </w:rPr>
+        <w:t>Image</w:t>
+      </w:r>
+      <w:r>
+        <w:t xml:space="preserve"> (bản đóng gói) sẵn sàng để sử dụng.</w:t>
+      </w:r>
+      <w:r>
+        <w:rPr>
+          <w:lang w:val="vi-VN"/>
+        </w:rPr>
+        <w:t>)</w:t>
+      </w:r>
+    </w:p>
+    <w:p>
+      <w:pPr>
+        <w:rPr>
+          <w:lang w:val="vi-VN"/>
+        </w:rPr>
+      </w:pPr>
+      <w:r>
+        <w:rPr>
+          <w:lang w:val="vi-VN"/>
+        </w:rPr>
+        <w:t>docker run -p 3000:3000 ex01-hello-app</w:t>
+      </w:r>
+      <w:r>
+        <w:rPr>
+          <w:lang w:val="vi-VN"/>
+        </w:rPr>
+        <w:t xml:space="preserve"> (chạy container)</w:t>
+      </w:r>
+    </w:p>
+    <w:p>
+      <w:pPr>
+        <w:rPr>
+          <w:lang w:val="vi-VN"/>
+        </w:rPr>
+      </w:pPr>
+      <w:r>
+        <w:rPr>
+          <w:lang w:val="vi-VN"/>
+        </w:rPr>
+        <w:lastRenderedPageBreak/>
+        <w:drawing>
+          <wp:inline distT="0" distB="0" distL="0" distR="0" wp14:anchorId="7FE35B02" wp14:editId="4039B25D">
+            <wp:extent cx="5943600" cy="3301365"/>
+            <wp:effectExtent l="0" t="0" r="0" b="0"/>
+            <wp:docPr id="6" name="Picture 6"/>
+            <wp:cNvGraphicFramePr>
+              <a:graphicFrameLocks xmlns:a="http://schemas.openxmlformats.org/drawingml/2006/main" noChangeAspect="1"/>
+            </wp:cNvGraphicFramePr>
+            <a:graphic xmlns:a="http://schemas.openxmlformats.org/drawingml/2006/main">
+              <a:graphicData uri="http://schemas.openxmlformats.org/drawingml/2006/picture">
+                <pic:pic xmlns:pic="http://schemas.openxmlformats.org/drawingml/2006/picture">
+                  <pic:nvPicPr>
+                    <pic:cNvPr id="1" name=""/>
+                    <pic:cNvPicPr/>
+                  </pic:nvPicPr>
+                  <pic:blipFill>
+                    <a:blip r:embed="rId34"/>
+                    <a:stretch>
+                      <a:fillRect/>
+                    </a:stretch>
+                  </pic:blipFill>
+                  <pic:spPr>
+                    <a:xfrm>
+                      <a:off x="0" y="0"/>
+                      <a:ext cx="5943600" cy="3301365"/>
+                    </a:xfrm>
+                    <a:prstGeom prst="rect">
+                      <a:avLst/>
+                    </a:prstGeom>
+                  </pic:spPr>
+                </pic:pic>
+              </a:graphicData>
+            </a:graphic>
+          </wp:inline>
+        </w:drawing>
+      </w:r>
+    </w:p>
+    <w:p>
+      <w:pPr>
+        <w:rPr>
+          <w:lang w:val="vi-VN"/>
+        </w:rPr>
+      </w:pPr>
+      <w:r>
+        <w:rPr>
+          <w:lang w:val="vi-VN"/>
+        </w:rPr>
+        <w:t>Bài 2:</w:t>
+      </w:r>
+    </w:p>
+    <w:p>
+      <w:pPr>
+        <w:rPr>
+          <w:lang w:val="vi-VN"/>
+        </w:rPr>
+      </w:pPr>
+      <w:r>
+        <w:rPr>
+          <w:lang w:val="vi-VN"/>
+        </w:rPr>
+        <w:t>docker build -t ex02-flask-app .</w:t>
+      </w:r>
+    </w:p>
+    <w:p>
+      <w:pPr>
+        <w:rPr>
+          <w:lang w:val="vi-VN"/>
+        </w:rPr>
+      </w:pPr>
+      <w:r>
+        <w:rPr>
+          <w:lang w:val="vi-VN"/>
+        </w:rPr>
+        <w:t>docker run -p 5000:5000 ex02-flask-app</w:t>
+      </w:r>
+    </w:p>
+    <w:p>
+      <w:pPr>
+        <w:rPr>
+          <w:lang w:val="vi-VN"/>
+        </w:rPr>
+      </w:pPr>
+      <w:r>
+        <w:rPr>
+          <w:lang w:val="vi-VN"/>
+        </w:rPr>
+        <w:drawing>
+          <wp:inline distT="0" distB="0" distL="0" distR="0" wp14:anchorId="1222774F" wp14:editId="4F73A938">
+            <wp:extent cx="5943600" cy="3342005"/>
+            <wp:effectExtent l="0" t="0" r="0" b="0"/>
+            <wp:docPr id="15" name="Picture 15"/>
+            <wp:cNvGraphicFramePr>
+              <a:graphicFrameLocks xmlns:a="http://schemas.openxmlformats.org/drawingml/2006/main" noChangeAspect="1"/>
+            </wp:cNvGraphicFramePr>
+            <a:graphic xmlns:a="http://schemas.openxmlformats.org/drawingml/2006/main">
+              <a:graphicData uri="http://schemas.openxmlformats.org/drawingml/2006/picture">
+                <pic:pic xmlns:pic="http://schemas.openxmlformats.org/drawingml/2006/picture">
+                  <pic:nvPicPr>
+                    <pic:cNvPr id="1" name=""/>
+                    <pic:cNvPicPr/>
+                  </pic:nvPicPr>
+                  <pic:blipFill>
+                    <a:blip r:embed="rId35"/>
+                    <a:stretch>
+                      <a:fillRect/>
+                    </a:stretch>
+                  </pic:blipFill>
+                  <pic:spPr>
+                    <a:xfrm>
+                      <a:off x="0" y="0"/>
+                      <a:ext cx="5943600" cy="3342005"/>
+                    </a:xfrm>
+                    <a:prstGeom prst="rect">
+                      <a:avLst/>
+                    </a:prstGeom>
+                  </pic:spPr>
+                </pic:pic>
+              </a:graphicData>
+            </a:graphic>
+          </wp:inline>
+        </w:drawing>
+      </w:r>
+    </w:p>
+    <w:p>
+      <w:pPr>
+        <w:rPr>
+          <w:lang w:val="vi-VN"/>
+        </w:rPr>
+      </w:pPr>
+      <w:r>
+        <w:rPr>
+          <w:lang w:val="vi-VN"/>
+        </w:rPr>
+        <w:t>Bài 3:</w:t>
+      </w:r>
+    </w:p>
+    <w:p>
+      <w:pPr>
+        <w:rPr>
+          <w:lang w:val="vi-VN"/>
+        </w:rPr>
+      </w:pPr>
+      <w:r>
+        <w:rPr>
+          <w:lang w:val="vi-VN"/>
+        </w:rPr>
+        <w:lastRenderedPageBreak/>
+        <w:t>docker build -t ex03-react-app .</w:t>
+      </w:r>
+    </w:p>
+    <w:p>
+      <w:pPr>
+        <w:rPr>
+          <w:lang w:val="vi-VN"/>
+        </w:rPr>
+      </w:pPr>
+      <w:r>
+        <w:rPr>
+          <w:lang w:val="vi-VN"/>
+        </w:rPr>
+        <w:t>docker run -p 3000:3000 ex03-react-app</w:t>
+      </w:r>
+    </w:p>
+    <w:p>
+      <w:pPr>
+        <w:rPr>
+          <w:lang w:val="vi-VN"/>
+        </w:rPr>
+      </w:pPr>
+      <w:r>
+        <w:rPr>
+          <w:lang w:val="vi-VN"/>
+        </w:rPr>
+        <w:t>lỗi do có port chiếm</w:t>
+      </w:r>
+    </w:p>
+    <w:p>
+      <w:pPr>
+        <w:rPr>
+          <w:lang w:val="vi-VN"/>
+        </w:rPr>
+      </w:pPr>
+      <w:r>
+        <w:rPr>
+          <w:lang w:val="vi-VN"/>
+        </w:rPr>
+        <w:t>docker ps</w:t>
+      </w:r>
+    </w:p>
+    <w:p>
+      <w:pPr>
+        <w:rPr>
+          <w:lang w:val="vi-VN"/>
+        </w:rPr>
+      </w:pPr>
+      <w:r>
+        <w:rPr>
+          <w:lang w:val="vi-VN"/>
+        </w:rPr>
+        <w:t>docker stop &lt;ID_hoặc_Tên_Container&gt;</w:t>
+      </w:r>
+    </w:p>
+    <w:p>
+      <w:pPr>
+        <w:rPr>
+          <w:lang w:val="vi-VN"/>
+        </w:rPr>
+      </w:pPr>
+      <w:r>
+        <w:rPr>
+          <w:lang w:val="vi-VN"/>
+        </w:rPr>
+        <w:drawing>
+          <wp:inline distT="0" distB="0" distL="0" distR="0" wp14:anchorId="2CF96FA8" wp14:editId="2B5246B0">
+            <wp:extent cx="5943600" cy="3140710"/>
+            <wp:effectExtent l="0" t="0" r="0" b="2540"/>
+            <wp:docPr id="26" name="Picture 26"/>
+            <wp:cNvGraphicFramePr>
+              <a:graphicFrameLocks xmlns:a="http://schemas.openxmlformats.org/drawingml/2006/main" noChangeAspect="1"/>
+            </wp:cNvGraphicFramePr>
+            <a:graphic xmlns:a="http://schemas.openxmlformats.org/drawingml/2006/main">
+              <a:graphicData uri="http://schemas.openxmlformats.org/drawingml/2006/picture">
+                <pic:pic xmlns:pic="http://schemas.openxmlformats.org/drawingml/2006/picture">
+                  <pic:nvPicPr>
+                    <pic:cNvPr id="1" name=""/>
+                    <pic:cNvPicPr/>
+                  </pic:nvPicPr>
+                  <pic:blipFill>
+                    <a:blip r:embed="rId36"/>
+                    <a:stretch>
+                      <a:fillRect/>
+                    </a:stretch>
+                  </pic:blipFill>
+                  <pic:spPr>
+                    <a:xfrm>
+                      <a:off x="0" y="0"/>
+                      <a:ext cx="5943600" cy="3140710"/>
+                    </a:xfrm>
+                    <a:prstGeom prst="rect">
+                      <a:avLst/>
+                    </a:prstGeom>
+                  </pic:spPr>
+                </pic:pic>
+              </a:graphicData>
+            </a:graphic>
+          </wp:inline>
+        </w:drawing>
+      </w:r>
+    </w:p>
+    <w:p>
+      <w:pPr>
+        <w:rPr>
+          <w:lang w:val="vi-VN"/>
+        </w:rPr>
+      </w:pPr>
+      <w:r>
+        <w:rPr>
+          <w:lang w:val="vi-VN"/>
+        </w:rPr>
+        <w:t>Bài 4:</w:t>
+      </w:r>
+    </w:p>
+    <w:p>
+      <w:pPr>
+        <w:rPr>
+          <w:lang w:val="vi-VN"/>
+        </w:rPr>
+      </w:pPr>
+      <w:r>
+        <w:rPr>
+          <w:lang w:val="vi-VN"/>
+        </w:rPr>
+        <w:t>docker build -t ex04-nginx-app .</w:t>
+      </w:r>
+    </w:p>
+    <w:p>
+      <w:pPr>
+        <w:rPr>
+          <w:lang w:val="vi-VN"/>
+        </w:rPr>
+      </w:pPr>
+      <w:r>
+        <w:rPr>
+          <w:lang w:val="vi-VN"/>
+        </w:rPr>
+        <w:t>docker run -d -p 8080:80 --name my-nginx-web ex04-nginx-app</w:t>
+      </w:r>
+    </w:p>
+    <w:p>
+      <w:pPr>
+        <w:rPr>
+          <w:lang w:val="vi-VN"/>
+        </w:rPr>
+      </w:pPr>
+      <w:hyperlink r:id="rId37" w:history="1">
+        <w:r>
+          <w:rPr>
+            <w:rStyle w:val="Hyperlink"/>
+          </w:rPr>
+          <w:t>http://localhost:8080</w:t>
+        </w:r>
+      </w:hyperlink>
+      <w:r>
+        <w:t>.</w:t>
+      </w:r>
+    </w:p>
+    <w:p>
+      <w:pPr>
+        <w:rPr>
+          <w:lang w:val="vi-VN"/>
+        </w:rPr>
+      </w:pPr>
+      <w:r>
+        <w:rPr>
+          <w:lang w:val="vi-VN"/>
+        </w:rPr>
+        <w:lastRenderedPageBreak/>
+        <w:drawing>
+          <wp:inline distT="0" distB="0" distL="0" distR="0" wp14:anchorId="27406563" wp14:editId="659D34D2">
+            <wp:extent cx="5943600" cy="3342005"/>
+            <wp:effectExtent l="0" t="0" r="0" b="0"/>
+            <wp:docPr id="33" name="Picture 33"/>
+            <wp:cNvGraphicFramePr>
+              <a:graphicFrameLocks xmlns:a="http://schemas.openxmlformats.org/drawingml/2006/main" noChangeAspect="1"/>
+            </wp:cNvGraphicFramePr>
+            <a:graphic xmlns:a="http://schemas.openxmlformats.org/drawingml/2006/main">
+              <a:graphicData uri="http://schemas.openxmlformats.org/drawingml/2006/picture">
+                <pic:pic xmlns:pic="http://schemas.openxmlformats.org/drawingml/2006/picture">
+                  <pic:nvPicPr>
+                    <pic:cNvPr id="1" name=""/>
+                    <pic:cNvPicPr/>
+                  </pic:nvPicPr>
+                  <pic:blipFill>
+                    <a:blip r:embed="rId38"/>
+                    <a:stretch>
+                      <a:fillRect/>
+                    </a:stretch>
+                  </pic:blipFill>
+                  <pic:spPr>
+                    <a:xfrm>
+                      <a:off x="0" y="0"/>
+                      <a:ext cx="5943600" cy="3342005"/>
+                    </a:xfrm>
+                    <a:prstGeom prst="rect">
+                      <a:avLst/>
+                    </a:prstGeom>
+                  </pic:spPr>
+                </pic:pic>
+              </a:graphicData>
+            </a:graphic>
+          </wp:inline>
+        </w:drawing>
+      </w:r>
+    </w:p>
+    <w:p>
+      <w:pPr>
+        <w:rPr>
+          <w:lang w:val="vi-VN"/>
+        </w:rPr>
+      </w:pPr>
+      <w:r>
+        <w:rPr>
+          <w:lang w:val="vi-VN"/>
+        </w:rPr>
+        <w:t>Bài 5:</w:t>
+      </w:r>
+    </w:p>
+    <w:p>
+      <w:pPr>
+        <w:rPr>
+          <w:lang w:val="vi-VN"/>
+        </w:rPr>
+      </w:pPr>
+      <w:r>
+        <w:rPr>
+          <w:lang w:val="vi-VN"/>
+        </w:rPr>
+        <w:t>go mod init ex05-go-app</w:t>
+      </w:r>
+      <w:r>
+        <w:rPr>
+          <w:lang w:val="vi-VN"/>
+        </w:rPr>
+        <w:t xml:space="preserve">  -&gt; tạo node module </w:t>
+      </w:r>
+    </w:p>
+    <w:p>
+      <w:pPr>
+        <w:rPr>
+          <w:lang w:val="vi-VN"/>
+        </w:rPr>
+      </w:pPr>
+      <w:r>
+        <w:rPr>
+          <w:lang w:val="vi-VN"/>
+        </w:rPr>
+        <w:t>docker build -t ex05-go-app .</w:t>
+      </w:r>
+    </w:p>
+    <w:p>
+      <w:pPr>
+        <w:rPr>
+          <w:lang w:val="vi-VN"/>
+        </w:rPr>
+      </w:pPr>
+      <w:r>
+        <w:rPr>
+          <w:lang w:val="vi-VN"/>
+        </w:rPr>
+        <w:t>docker run -p 8080:8080 ex05-go-app</w:t>
+      </w:r>
+    </w:p>
+    <w:p>
+      <w:pPr>
+        <w:rPr>
+          <w:lang w:val="vi-VN"/>
+        </w:rPr>
+      </w:pPr>
+      <w:r>
+        <w:rPr>
+          <w:lang w:val="vi-VN"/>
+        </w:rPr>
+        <w:drawing>
+          <wp:inline distT="0" distB="0" distL="0" distR="0" wp14:anchorId="561CCCD2" wp14:editId="4E6AFCE6">
+            <wp:extent cx="5943600" cy="3162300"/>
+            <wp:effectExtent l="0" t="0" r="0" b="0"/>
+            <wp:docPr id="34" name="Picture 34"/>
+            <wp:cNvGraphicFramePr>
+              <a:graphicFrameLocks xmlns:a="http://schemas.openxmlformats.org/drawingml/2006/main" noChangeAspect="1"/>
+            </wp:cNvGraphicFramePr>
+            <a:graphic xmlns:a="http://schemas.openxmlformats.org/drawingml/2006/main">
+              <a:graphicData uri="http://schemas.openxmlformats.org/drawingml/2006/picture">
+                <pic:pic xmlns:pic="http://schemas.openxmlformats.org/drawingml/2006/picture">
+                  <pic:nvPicPr>
+                    <pic:cNvPr id="1" name=""/>
+                    <pic:cNvPicPr/>
+                  </pic:nvPicPr>
+                  <pic:blipFill>
+                    <a:blip r:embed="rId39"/>
+                    <a:stretch>
+                      <a:fillRect/>
+                    </a:stretch>
+                  </pic:blipFill>
+                  <pic:spPr>
+                    <a:xfrm>
+                      <a:off x="0" y="0"/>
+                      <a:ext cx="5943600" cy="3162300"/>
+                    </a:xfrm>
+                    <a:prstGeom prst="rect">
+                      <a:avLst/>
+                    </a:prstGeom>
+                  </pic:spPr>
+                </pic:pic>
+              </a:graphicData>
+            </a:graphic>
+          </wp:inline>
+        </w:drawing>
+      </w:r>
+    </w:p>
+    <w:p>
+      <w:pPr>
+        <w:rPr>
+          <w:lang w:val="vi-VN"/>
+        </w:rPr>
+      </w:pPr>
+      <w:r>
+        <w:rPr>
+          <w:lang w:val="vi-VN"/>
+        </w:rPr>
+        <w:t>Bài 6:</w:t>
+      </w:r>
+    </w:p>
+    <w:p>
+      <w:pPr>
+        <w:rPr>
+          <w:lang w:val="vi-VN"/>
+        </w:rPr>
+      </w:pPr>
+      <w:r>
+        <w:rPr>
+          <w:lang w:val="vi-VN"/>
+        </w:rPr>
+        <w:lastRenderedPageBreak/>
+        <w:t>docker build -t ex06-multi-stage .</w:t>
+      </w:r>
+    </w:p>
+    <w:p>
+      <w:pPr>
+        <w:rPr>
+          <w:lang w:val="vi-VN"/>
+        </w:rPr>
+      </w:pPr>
+      <w:r>
+        <w:rPr>
+          <w:lang w:val="vi-VN"/>
+        </w:rPr>
+        <w:t>docker run -d -p 3000:3000 ex06-multi-stage</w:t>
+      </w:r>
+    </w:p>
+    <w:p>
+      <w:pPr>
+        <w:rPr>
+          <w:lang w:val="vi-VN"/>
+        </w:rPr>
+      </w:pPr>
+      <w:r>
+        <w:rPr>
+          <w:lang w:val="vi-VN"/>
+        </w:rPr>
+        <w:drawing>
+          <wp:inline distT="0" distB="0" distL="0" distR="0" wp14:anchorId="6FFBA13F" wp14:editId="2119CF4C">
+            <wp:extent cx="5943600" cy="2642870"/>
+            <wp:effectExtent l="0" t="0" r="0" b="5080"/>
+            <wp:docPr id="35" name="Picture 35"/>
+            <wp:cNvGraphicFramePr>
+              <a:graphicFrameLocks xmlns:a="http://schemas.openxmlformats.org/drawingml/2006/main" noChangeAspect="1"/>
+            </wp:cNvGraphicFramePr>
+            <a:graphic xmlns:a="http://schemas.openxmlformats.org/drawingml/2006/main">
+              <a:graphicData uri="http://schemas.openxmlformats.org/drawingml/2006/picture">
+                <pic:pic xmlns:pic="http://schemas.openxmlformats.org/drawingml/2006/picture">
+                  <pic:nvPicPr>
+                    <pic:cNvPr id="1" name=""/>
+                    <pic:cNvPicPr/>
+                  </pic:nvPicPr>
+                  <pic:blipFill>
+                    <a:blip r:embed="rId40"/>
+                    <a:stretch>
+                      <a:fillRect/>
+                    </a:stretch>
+                  </pic:blipFill>
+                  <pic:spPr>
+                    <a:xfrm>
+                      <a:off x="0" y="0"/>
+                      <a:ext cx="5943600" cy="2642870"/>
+                    </a:xfrm>
+                    <a:prstGeom prst="rect">
+                      <a:avLst/>
+                    </a:prstGeom>
+                  </pic:spPr>
+                </pic:pic>
+              </a:graphicData>
+            </a:graphic>
+          </wp:inline>
+        </w:drawing>
+      </w:r>
+    </w:p>
+    <w:p>
+      <w:pPr>
+        <w:rPr>
+          <w:lang w:val="vi-VN"/>
+        </w:rPr>
+      </w:pPr>
+      <w:r>
+        <w:rPr>
+          <w:lang w:val="vi-VN"/>
+        </w:rPr>
+        <w:t xml:space="preserve">ổ đĩa sử dụng chỉ bằng 1/10 so với node bình thường, </w:t>
+      </w:r>
+      <w:r>
+        <w:t>chênh lệch dung lượng giữa 2 Image</w:t>
+      </w:r>
+      <w:r>
+        <w:rPr>
+          <w:lang w:val="vi-VN"/>
+        </w:rPr>
+        <w:t xml:space="preserve"> thấy gõ giữa ex01 và ex06</w:t>
+      </w:r>
+    </w:p>
+    <w:p>
+      <w:pPr>
+        <w:rPr>
+          <w:lang w:val="vi-VN"/>
+        </w:rPr>
+      </w:pPr>
+      <w:r>
+        <w:rPr>
+          <w:lang w:val="vi-VN"/>
+        </w:rPr>
+        <w:t>Bài 7:</w:t>
+      </w:r>
+    </w:p>
+    <w:p>
+      <w:pPr>
+        <w:rPr>
+          <w:lang w:val="vi-VN"/>
+        </w:rPr>
+      </w:pPr>
+      <w:r>
+        <w:rPr>
+          <w:lang w:val="vi-VN"/>
+        </w:rPr>
+        <w:t>docker build -t ex07-env-app .</w:t>
+      </w:r>
+    </w:p>
+    <w:p>
+      <w:pPr>
+        <w:rPr>
+          <w:lang w:val="vi-VN"/>
+        </w:rPr>
+      </w:pPr>
+      <w:r>
+        <w:rPr>
+          <w:lang w:val="vi-VN"/>
+        </w:rPr>
+        <w:t>docker run ex07-env-app</w:t>
+      </w:r>
+      <w:r>
+        <w:rPr>
+          <w:lang w:val="vi-VN"/>
+        </w:rPr>
+        <w:t xml:space="preserve">  -&gt; chạy ở môi trường development</w:t>
+      </w:r>
+    </w:p>
+    <w:p>
+      <w:pPr>
+        <w:rPr>
+          <w:lang w:val="vi-VN"/>
+        </w:rPr>
+      </w:pPr>
+      <w:r>
+        <w:rPr>
+          <w:lang w:val="vi-VN"/>
+        </w:rPr>
+        <w:t>docker run -e APP_ENV=production ex07-env-app</w:t>
+      </w:r>
+      <w:r>
+        <w:rPr>
+          <w:lang w:val="vi-VN"/>
+        </w:rPr>
+        <w:t xml:space="preserve"> -&gt; chạy ở môt trường product mà k cần build lại</w:t>
+      </w:r>
+    </w:p>
+    <w:p>
+      <w:pPr>
+        <w:rPr>
+          <w:lang w:val="vi-VN"/>
+        </w:rPr>
+      </w:pPr>
+      <w:r>
+        <w:rPr>
+          <w:lang w:val="vi-VN"/>
+        </w:rPr>
+        <w:drawing>
+          <wp:inline distT="0" distB="0" distL="0" distR="0" wp14:anchorId="0A7C9F48" wp14:editId="78AA8F8E">
+            <wp:extent cx="5943600" cy="2728595"/>
+            <wp:effectExtent l="0" t="0" r="0" b="0"/>
+            <wp:docPr id="36" name="Picture 36"/>
+            <wp:cNvGraphicFramePr>
+              <a:graphicFrameLocks xmlns:a="http://schemas.openxmlformats.org/drawingml/2006/main" noChangeAspect="1"/>
+            </wp:cNvGraphicFramePr>
+            <a:graphic xmlns:a="http://schemas.openxmlformats.org/drawingml/2006/main">
+              <a:graphicData uri="http://schemas.openxmlformats.org/drawingml/2006/picture">
+                <pic:pic xmlns:pic="http://schemas.openxmlformats.org/drawingml/2006/picture">
+                  <pic:nvPicPr>
+                    <pic:cNvPr id="1" name=""/>
+                    <pic:cNvPicPr/>
+                  </pic:nvPicPr>
+                  <pic:blipFill>
+                    <a:blip r:embed="rId41"/>
+                    <a:stretch>
+                      <a:fillRect/>
+                    </a:stretch>
+                  </pic:blipFill>
+                  <pic:spPr>
+                    <a:xfrm>
+                      <a:off x="0" y="0"/>
+                      <a:ext cx="5943600" cy="2728595"/>
+                    </a:xfrm>
+                    <a:prstGeom prst="rect">
+                      <a:avLst/>
+                    </a:prstGeom>
+                  </pic:spPr>
+                </pic:pic>
+              </a:graphicData>
+            </a:graphic>
+          </wp:inline>
+        </w:drawing>
+      </w:r>
+    </w:p>
+    <w:p>
+      <w:pPr>
+        <w:rPr>
+          <w:lang w:val="vi-VN"/>
+        </w:rPr>
+      </w:pPr>
+      <w:r>
+        <w:rPr>
+          <w:lang w:val="vi-VN"/>
+        </w:rPr>
+        <w:lastRenderedPageBreak/>
+        <w:t>Bài 8:</w:t>
+      </w:r>
+    </w:p>
+    <w:p>
+      <w:pPr>
+        <w:rPr>
+          <w:lang w:val="vi-VN"/>
+        </w:rPr>
+      </w:pPr>
+      <w:r>
+        <w:rPr>
+          <w:lang w:val="vi-VN"/>
+        </w:rPr>
+        <w:t>docker build -t ex08-postgres-custom .</w:t>
+      </w:r>
+    </w:p>
+    <w:p>
+      <w:pPr>
+        <w:rPr>
+          <w:lang w:val="vi-VN"/>
+        </w:rPr>
+      </w:pPr>
+      <w:r>
+        <w:rPr>
+          <w:lang w:val="vi-VN"/>
+        </w:rPr>
+        <w:t>docker run -d -p 5433:5432 --name my-postgres ex08-postgres-custom</w:t>
+      </w:r>
+    </w:p>
+    <w:p>
+      <w:pPr>
+        <w:rPr>
+          <w:lang w:val="vi-VN"/>
+        </w:rPr>
+      </w:pPr>
+      <w:r>
+        <w:t>Truy cập vào container:</w:t>
+      </w:r>
+    </w:p>
+    <w:p>
+      <w:pPr>
+        <w:rPr>
+          <w:lang w:val="vi-VN"/>
+        </w:rPr>
+      </w:pPr>
+      <w:r>
+        <w:rPr>
+          <w:lang w:val="vi-VN"/>
+        </w:rPr>
+        <w:t>docker exec -it my-postgres psql -U myuser -d mydb</w:t>
+      </w:r>
+    </w:p>
+    <w:p>
+      <w:pPr>
+        <w:rPr>
+          <w:lang w:val="vi-VN"/>
+        </w:rPr>
+      </w:pPr>
+      <w:r>
+        <w:rPr>
+          <w:lang w:val="vi-VN"/>
+        </w:rPr>
+        <w:t>SELECT * FROM users;</w:t>
+      </w:r>
+    </w:p>
+    <w:p>
+      <w:pPr>
+        <w:rPr>
+          <w:lang w:val="vi-VN"/>
+        </w:rPr>
+      </w:pPr>
+      <w:r>
+        <w:rPr>
+          <w:lang w:val="vi-VN"/>
+        </w:rPr>
+        <w:drawing>
+          <wp:inline distT="0" distB="0" distL="0" distR="0" wp14:anchorId="765473A2" wp14:editId="116D92E2">
+            <wp:extent cx="5943600" cy="1641475"/>
+            <wp:effectExtent l="0" t="0" r="0" b="0"/>
+            <wp:docPr id="37" name="Picture 37"/>
+            <wp:cNvGraphicFramePr>
+              <a:graphicFrameLocks xmlns:a="http://schemas.openxmlformats.org/drawingml/2006/main" noChangeAspect="1"/>
+            </wp:cNvGraphicFramePr>
+            <a:graphic xmlns:a="http://schemas.openxmlformats.org/drawingml/2006/main">
+              <a:graphicData uri="http://schemas.openxmlformats.org/drawingml/2006/picture">
+                <pic:pic xmlns:pic="http://schemas.openxmlformats.org/drawingml/2006/picture">
+                  <pic:nvPicPr>
+                    <pic:cNvPr id="1" name=""/>
+                    <pic:cNvPicPr/>
+                  </pic:nvPicPr>
+                  <pic:blipFill>
+                    <a:blip r:embed="rId42"/>
+                    <a:stretch>
+                      <a:fillRect/>
+                    </a:stretch>
+                  </pic:blipFill>
+                  <pic:spPr>
+                    <a:xfrm>
+                      <a:off x="0" y="0"/>
+                      <a:ext cx="5943600" cy="1641475"/>
+                    </a:xfrm>
+                    <a:prstGeom prst="rect">
+                      <a:avLst/>
+                    </a:prstGeom>
+                  </pic:spPr>
+                </pic:pic>
+              </a:graphicData>
+            </a:graphic>
+          </wp:inline>
+        </w:drawing>
+      </w:r>
+    </w:p>
+    <w:p>
+      <w:pPr>
+        <w:rPr>
+          <w:lang w:val="vi-VN"/>
+        </w:rPr>
+      </w:pPr>
+      <w:r>
+        <w:rPr>
+          <w:lang w:val="vi-VN"/>
+        </w:rPr>
+        <w:t>Bài 9:</w:t>
+      </w:r>
+    </w:p>
+    <w:p>
+      <w:pPr>
+        <w:rPr>
+          <w:lang w:val="vi-VN"/>
+        </w:rPr>
+      </w:pPr>
+      <w:r>
+        <w:rPr>
+          <w:lang w:val="vi-VN"/>
+        </w:rPr>
+        <w:t>docker build -t ex09-redis-custom .</w:t>
+      </w:r>
+    </w:p>
+    <w:p>
+      <w:pPr>
+        <w:rPr>
+          <w:lang w:val="vi-VN"/>
+        </w:rPr>
+      </w:pPr>
+      <w:r>
+        <w:rPr>
+          <w:lang w:val="vi-VN"/>
+        </w:rPr>
+        <w:t>docker run -d -p 6379:6379 --name my-custom-redis ex09-redis-custom</w:t>
+      </w:r>
+    </w:p>
+    <w:p>
+      <w:pPr>
+        <w:rPr>
+          <w:lang w:val="vi-VN"/>
+        </w:rPr>
+      </w:pPr>
+      <w:r>
+        <w:rPr>
+          <w:lang w:val="vi-VN"/>
+        </w:rPr>
+        <w:drawing>
+          <wp:inline distT="0" distB="0" distL="0" distR="0" wp14:anchorId="3BBDB1F4" wp14:editId="7458850E">
+            <wp:extent cx="5943600" cy="1223010"/>
+            <wp:effectExtent l="0" t="0" r="0" b="0"/>
+            <wp:docPr id="38" name="Picture 38"/>
+            <wp:cNvGraphicFramePr>
+              <a:graphicFrameLocks xmlns:a="http://schemas.openxmlformats.org/drawingml/2006/main" noChangeAspect="1"/>
+            </wp:cNvGraphicFramePr>
+            <a:graphic xmlns:a="http://schemas.openxmlformats.org/drawingml/2006/main">
+              <a:graphicData uri="http://schemas.openxmlformats.org/drawingml/2006/picture">
+                <pic:pic xmlns:pic="http://schemas.openxmlformats.org/drawingml/2006/picture">
+                  <pic:nvPicPr>
+                    <pic:cNvPr id="1" name=""/>
+                    <pic:cNvPicPr/>
+                  </pic:nvPicPr>
+                  <pic:blipFill>
+                    <a:blip r:embed="rId43"/>
+                    <a:stretch>
+                      <a:fillRect/>
+                    </a:stretch>
+                  </pic:blipFill>
+                  <pic:spPr>
+                    <a:xfrm>
+                      <a:off x="0" y="0"/>
+                      <a:ext cx="5943600" cy="1223010"/>
+                    </a:xfrm>
+                    <a:prstGeom prst="rect">
+                      <a:avLst/>
+                    </a:prstGeom>
+                  </pic:spPr>
+                </pic:pic>
+              </a:graphicData>
+            </a:graphic>
+          </wp:inline>
+        </w:drawing>
+      </w:r>
+    </w:p>
+    <w:p>
+      <w:pPr>
+        <w:rPr>
+          <w:lang w:val="vi-VN"/>
+        </w:rPr>
+      </w:pPr>
+      <w:r>
+        <w:rPr>
+          <w:lang w:val="vi-VN"/>
+        </w:rPr>
+        <w:t>Bài 10:</w:t>
+      </w:r>
+    </w:p>
+    <w:p>
+      <w:pPr>
+        <w:rPr>
+          <w:lang w:val="vi-VN"/>
+        </w:rPr>
+      </w:pPr>
+      <w:r>
+        <w:rPr>
+          <w:lang w:val="vi-VN"/>
+        </w:rPr>
+        <w:t>docker build -t ex10-php-apache .</w:t>
+      </w:r>
+    </w:p>
+    <w:p>
+      <w:pPr>
+        <w:rPr>
+          <w:lang w:val="vi-VN"/>
+        </w:rPr>
+      </w:pPr>
+      <w:r>
+        <w:rPr>
+          <w:lang w:val="vi-VN"/>
+        </w:rPr>
+        <w:t>docker run -d -p 8081:80 -v %cd%:/var/www/html --name my-php-app ex10-php-apache</w:t>
+      </w:r>
+    </w:p>
+    <w:p>
+      <w:pPr>
+        <w:rPr>
+          <w:lang w:val="vi-VN"/>
+        </w:rPr>
+      </w:pPr>
+      <w:r>
+        <w:rPr>
+          <w:lang w:val="vi-VN"/>
+        </w:rPr>
+        <w:lastRenderedPageBreak/>
+        <w:drawing>
+          <wp:inline distT="0" distB="0" distL="0" distR="0" wp14:anchorId="35485C70" wp14:editId="326570E2">
+            <wp:extent cx="5943600" cy="3223895"/>
+            <wp:effectExtent l="0" t="0" r="0" b="0"/>
+            <wp:docPr id="39" name="Picture 39"/>
+            <wp:cNvGraphicFramePr>
+              <a:graphicFrameLocks xmlns:a="http://schemas.openxmlformats.org/drawingml/2006/main" noChangeAspect="1"/>
+            </wp:cNvGraphicFramePr>
+            <a:graphic xmlns:a="http://schemas.openxmlformats.org/drawingml/2006/main">
+              <a:graphicData uri="http://schemas.openxmlformats.org/drawingml/2006/picture">
+                <pic:pic xmlns:pic="http://schemas.openxmlformats.org/drawingml/2006/picture">
+                  <pic:nvPicPr>
+                    <pic:cNvPr id="1" name=""/>
+                    <pic:cNvPicPr/>
+                  </pic:nvPicPr>
+                  <pic:blipFill>
+                    <a:blip r:embed="rId44"/>
+                    <a:stretch>
+                      <a:fillRect/>
+                    </a:stretch>
+                  </pic:blipFill>
+                  <pic:spPr>
+                    <a:xfrm>
+                      <a:off x="0" y="0"/>
+                      <a:ext cx="5943600" cy="3223895"/>
+                    </a:xfrm>
+                    <a:prstGeom prst="rect">
+                      <a:avLst/>
+                    </a:prstGeom>
+                  </pic:spPr>
+                </pic:pic>
+              </a:graphicData>
+            </a:graphic>
+          </wp:inline>
+        </w:drawing>
+      </w:r>
+    </w:p>
     <w:sectPr>
       <w:pgSz w:w="12240" w:h="15840"/>
       <w:pgMar w:top="1440" w:right="1440" w:bottom="1440" w:left="1440" w:header="720" w:footer="720" w:gutter="0"/>
@@ -3338,6 +4492,29 @@
       <w:spacing w:val="5"/>
     </w:rPr>
   </w:style>
+  <w:style w:type="character" w:styleId="Hyperlink">
+    <w:name w:val="Hyperlink"/>
+    <w:basedOn w:val="DefaultParagraphFont"/>
+    <w:uiPriority w:val="99"/>
+    <w:unhideWhenUsed/>
+    <w:rsid w:val="00C26541"/>
+    <w:rPr>
+      <w:color w:val="467886" w:themeColor="hyperlink"/>
+      <w:u w:val="single"/>
+    </w:rPr>
+  </w:style>
+  <w:style w:type="character" w:styleId="UnresolvedMention">
+    <w:name w:val="Unresolved Mention"/>
+    <w:basedOn w:val="DefaultParagraphFont"/>
+    <w:uiPriority w:val="99"/>
+    <w:semiHidden/>
+    <w:unhideWhenUsed/>
+    <w:rsid w:val="00C26541"/>
+    <w:rPr>
+      <w:color w:val="605E5C"/>
+      <w:shd w:val="clear" w:color="auto" w:fill="E1DFDD"/>
+    </w:rPr>
+  </w:style>
 </w:styles>
 </file>
 

</xml_diff>